<commit_message>
fix: address layout matrix review
</commit_message>
<xml_diff>
--- a/parity/fixtures/pairwise-layout-interactions.docx
+++ b/parity/fixtures/pairwise-layout-interactions.docx
@@ -1215,11 +1215,6 @@
       </w:r>
     </w:p>
     <w:p>
-      <w:r>
-        <w:br w:type="page"/>
-      </w:r>
-    </w:p>
-    <w:p>
       <w:pPr>
         <w:pStyle w:val="Heading1"/>
       </w:pPr>
@@ -1307,11 +1302,6 @@
       </w:r>
     </w:p>
     <w:p>
-      <w:r>
-        <w:br w:type="page"/>
-      </w:r>
-    </w:p>
-    <w:p>
       <w:pPr>
         <w:pStyle w:val="Heading1"/>
       </w:pPr>
@@ -2127,11 +2117,6 @@
       </w:r>
     </w:p>
     <w:p>
-      <w:r>
-        <w:br w:type="page"/>
-      </w:r>
-    </w:p>
-    <w:p>
       <w:pPr>
         <w:pStyle w:val="Heading1"/>
       </w:pPr>
@@ -2252,11 +2237,6 @@
       </w:r>
     </w:p>
     <w:p>
-      <w:r>
-        <w:br w:type="page"/>
-      </w:r>
-    </w:p>
-    <w:p>
       <w:pPr>
         <w:pStyle w:val="Heading1"/>
       </w:pPr>
@@ -3296,11 +3276,6 @@
       </w:r>
     </w:p>
     <w:p>
-      <w:r>
-        <w:br w:type="page"/>
-      </w:r>
-    </w:p>
-    <w:p>
       <w:pPr>
         <w:pStyle w:val="Heading1"/>
       </w:pPr>
@@ -3389,11 +3364,6 @@
       </w:pPr>
       <w:r>
         <w:t>Section boundary</w:t>
-      </w:r>
-    </w:p>
-    <w:p>
-      <w:r>
-        <w:br w:type="page"/>
       </w:r>
     </w:p>
     <w:p>

</xml_diff>